<commit_message>
now with easy to use frontend
</commit_message>
<xml_diff>
--- a/docs/Secure_Agent_Lab_Handout.docx
+++ b/docs/Secure_Agent_Lab_Handout.docx
@@ -424,12 +424,208 @@
       </w:r>
     </w:p>
     <w:p>
+      <w:pPr>
+        <w:pStyle w:val="Heading2"/>
+      </w:pPr>
+      <w:r>
+        <w:t>Reading the presenter output and evidence</w:t>
+      </w:r>
+    </w:p>
+    <w:p>
+      <w:pPr/>
+      <w:r>
+        <w:rPr>
+          <w:b/>
+        </w:rPr>
+        <w:t xml:space="preserve">Read the introduction  </w:t>
+      </w:r>
+      <w:r>
+        <w:t>Each demo prints its purpose, a code execution flow and numbered stages. Use the flow to explain which script coordinates work and which C# component or operating-system boundary enforces the safeguard. Rebuild Release after changing host-run C#; the launchers execute compiled DLLs. Docker builds container binaries, while the host artifact helper also requires a Release build.</w:t>
+      </w:r>
+    </w:p>
+    <w:p>
+      <w:pPr/>
+      <w:r>
+        <w:rPr>
+          <w:b/>
+        </w:rPr>
+        <w:t xml:space="preserve">Read the result  </w:t>
+      </w:r>
+      <w:r>
+        <w:t>Allowed, Denied and ApprovalRequired describe individual decisions. The final Result reports the invocation outcome. A denied attack may be a successful check. FAILED means inspect the original error and partial evidence; do not infer success from earlier PASS lines.</w:t>
+      </w:r>
+    </w:p>
+    <w:p>
+      <w:pPr/>
+      <w:r>
+        <w:rPr>
+          <w:b/>
+        </w:rPr>
+        <w:t xml:space="preserve">Open the evidence guide  </w:t>
+      </w:r>
+      <w:r>
+        <w:t>Each case keeps artifacts/&lt;case&gt;/latest/artifact-index.md. It lists existing files with relative links, explains their contents and significance, and records the run number and completion result. Terminal links are clickable where supported; otherwise use the printed full paths or open the Markdown guide.</w:t>
+      </w:r>
+    </w:p>
+    <w:p>
+      <w:pPr/>
+      <w:r>
+        <w:rPr>
+          <w:b/>
+        </w:rPr>
+        <w:t xml:space="preserve">Use the supporting files  </w:t>
+      </w:r>
+      <w:r>
+        <w:t>run.json identifies the attempt and lifecycle timestamps; FinishedUtc alone is not a pass verdict. Basic/durable gateway demos retain worker-decisions.log and effects.json for decisions and operator-observed effect counts. Container build.log contains verbose build diagnostics. The index describes the other files generated by that case.</w:t>
+      </w:r>
+    </w:p>
+    <w:p>
+      <w:pPr/>
+      <w:r>
+        <w:rPr>
+          <w:b/>
+        </w:rPr>
+        <w:t xml:space="preserve">Save before rerunning  </w:t>
+      </w:r>
+      <w:r>
+        <w:t>The next invocation overwrites that case's latest set. RunNumber increases using counters in artifacts/.runs. Copy important evidence elsewhere before rerunning, and review private runtime state before sharing. Wrapper demos link companion gateway guides; comparison suites link only the selected evidence sets.</w:t>
+      </w:r>
+    </w:p>
+    <w:p>
+      <w:pPr>
+        <w:pStyle w:val="Heading2"/>
+      </w:pPr>
+      <w:r>
+        <w:t>How the scripts connect to code</w:t>
+      </w:r>
+    </w:p>
+    <w:p>
+      <w:pPr/>
+      <w:r>
+        <w:rPr>
+          <w:b/>
+        </w:rPr>
+        <w:t xml:space="preserve">Run-Lab.ps1  </w:t>
+      </w:r>
+      <w:r>
+        <w:t>The coordinator issues credentials and creates a scoped run. Worker proposals travel over HTTP to the API, Gateway and DefaultPolicy. Only permitted tools run; the coordinator checks actual effects and stops the gateway.</w:t>
+      </w:r>
+    </w:p>
+    <w:p>
+      <w:pPr/>
+      <w:r>
+        <w:rPr>
+          <w:b/>
+        </w:rPr>
+        <w:t xml:space="preserve">Run-DocumentLab.ps1  </w:t>
+      </w:r>
+      <w:r>
+        <w:t>Creates pinned synthetic files, then calls Run-Lab with DocumentRoot. FileDocumentReader resolves scoped IDs under a host-owned root; the worker cannot choose arbitrary paths.</w:t>
+      </w:r>
+    </w:p>
+    <w:p>
+      <w:pPr/>
+      <w:r>
+        <w:rPr>
+          <w:b/>
+        </w:rPr>
+        <w:t xml:space="preserve">Run-ModelLab.ps1  </w:t>
+      </w:r>
+      <w:r>
+        <w:t>Loads an offline adversarial fixture by default. Explicit -Live mode uses ModelHost and ResponsesProposalClient. ModelProposalSource validates proposals; the gateway independently authorizes them. Model output grants no authority.</w:t>
+      </w:r>
+    </w:p>
+    <w:p>
+      <w:pPr/>
+      <w:r>
+        <w:rPr>
+          <w:b/>
+        </w:rPr>
+        <w:t xml:space="preserve">Run-DurableLab.ps1  </w:t>
+      </w:r>
+      <w:r>
+        <w:t>Starts the audit collector and DurableGateway, reviews a fixed publication, restarts the gateway and retries with the same idempotency key. The expected result is exactly one publication with retained audit evidence.</w:t>
+      </w:r>
+    </w:p>
+    <w:p>
+      <w:pPr/>
+      <w:r>
+        <w:rPr>
+          <w:b/>
+        </w:rPr>
+        <w:t xml:space="preserve">Run-ResponseDrill.ps1  </w:t>
+      </w:r>
+      <w:r>
+        <w:t>Runs DurableChecks --drill and Phase7Checks. Synthetic cases exercise budgets, deadlines, revocation, audit failure and recovery. Check later effects separately from earlier completed work.</w:t>
+      </w:r>
+    </w:p>
+    <w:p>
+      <w:pPr/>
+      <w:r>
+        <w:rPr>
+          <w:b/>
+        </w:rPr>
+        <w:t xml:space="preserve">Run-CollaborationLab.ps1  </w:t>
+      </w:r>
+      <w:r>
+        <w:t>Runs DemoRunner with separate local broker and evaluator services. Scoped agent messages produce a submission that is checked for the correct answer and authorized method. This is a desktop service demo.</w:t>
+      </w:r>
+    </w:p>
+    <w:p>
+      <w:pPr/>
+      <w:r>
+        <w:rPr>
+          <w:b/>
+        </w:rPr>
+        <w:t xml:space="preserve">Run-IsolatedLab.ps1  </w:t>
+      </w:r>
+      <w:r>
+        <w:t>Builds the Compose topology, probes filesystem/network bypasses and submits permitted work through the relay and gateway. Checks two reads, zero publications and an unchanged protected canary.</w:t>
+      </w:r>
+    </w:p>
+    <w:p>
+      <w:pPr/>
+      <w:r>
+        <w:rPr>
+          <w:b/>
+        </w:rPr>
+        <w:t xml:space="preserve">Run-IsolatedCollaborationLab.ps1  </w:t>
+      </w:r>
+      <w:r>
+        <w:t>Adds container boundaries to researcher/writer collaboration, probes alternate channels and uses an independent evaluator. Checks two messages and one submission, then removes owned containers.</w:t>
+      </w:r>
+    </w:p>
+    <w:p>
+      <w:pPr/>
+      <w:r>
+        <w:rPr>
+          <w:b/>
+        </w:rPr>
+        <w:t xml:space="preserve">Run-ComparisonLab.ps1  </w:t>
+      </w:r>
+      <w:r>
+        <w:t>Selects portable and/or container pairs, validates their verdicts and assembles linked summaries. A pair needs an observed unsafe failure, secure prevention and a successful legitimate control.</w:t>
+      </w:r>
+    </w:p>
+    <w:p>
+      <w:pPr/>
+      <w:r>
+        <w:rPr>
+          <w:b/>
+        </w:rPr>
+        <w:t xml:space="preserve">Run-ContainerComparisons.ps1  </w:t>
+      </w:r>
+      <w:r>
+        <w:t>Runs contained unsafe/secure variants. Measures fake-secret transfer to a local capture service and late writes after stop. Outer containment still protects the host during the unsafe variant.</w:t>
+      </w:r>
+    </w:p>
+    <w:p>
       <w:r>
         <w:rPr>
           <w:b w:val="0"/>
           <w:sz w:val="18"/>
         </w:rPr>
-        <w:t>Scope: synthetic documents and reports. The original isolation demo, isolated collaboration and all twelve comparison pairs passed locally. Linux and Windows CI check jobs passed in Actions run 2; a passing isolation CI run on the final fixes still needs confirmation. Optional live model calls have not been verified. Prepared 9 October 2026.</w:t>
+        <w:t>Scope: synthetic documents and reports. The original isolation demo, isolated collaboration and all twelve comparison pairs passed locally. Linux and Windows CI check jobs passed in Actions run 2; a passing isolation CI run on the final fixes still needs confirmation. Optional live model calls have not been verified. Content reviewed 12 October 2026. This is a documentation review; verification dates above are unchanged.</w:t>
       </w:r>
     </w:p>
     <w:p>
@@ -1208,7 +1404,7 @@
         <w:rPr>
           <w:b w:val="0"/>
         </w:rPr>
-        <w:t xml:space="preserve">  The script preserves worker logs and relay/firewall diagnostics before cleanup. Look under artifacts/isolation. A failed CI job uploads an isolation-diagnostics artifact.</w:t>
+        <w:t xml:space="preserve">  The script preserves worker logs and relay/firewall diagnostics before cleanup. Look under artifacts/isolation/latest. A failed CI job uploads an isolation-diagnostics artifact.</w:t>
       </w:r>
     </w:p>
     <w:p>
@@ -2166,7 +2362,7 @@
         <w:rPr>
           <w:b w:val="0"/>
         </w:rPr>
-        <w:t xml:space="preserve">  Read the printed artifacts/phase8 directory. It contains the signed synthetic transcript, public verification key and evaluation result, with no bearer credentials or private keys. The launcher stops both owned service processes on success or failure. Evidence remains for review.</w:t>
+        <w:t xml:space="preserve">  Read the printed artifacts/phase8/latest directory. It contains the signed synthetic transcript, public verification key and evaluation result, with no bearer credentials or private keys. The launcher stops both owned service processes on success or failure. Evidence remains for review.</w:t>
       </w:r>
     </w:p>
     <w:p>
@@ -3967,7 +4163,7 @@
         <w:rPr>
           <w:b w:val="0"/>
         </w:rPr>
-        <w:t>The printed artifacts/comparisons/suite directory contains an overview linking measured effect summaries. Container evidence includes exact capture bytes, stop/late/exit timestamps, revocation/kill flags and safe deployment settings. Credentials and private signing keys are excluded from those summaries. Keep raw fixture state private: it can include short-lived synthetic run or approval identifiers.</w:t>
+        <w:t>The printed artifacts/comparisons/suite/latest directory contains an overview linking measured effect summaries. Container evidence includes exact capture bytes, stop/late/exit timestamps, revocation/kill flags and safe deployment settings. Credentials and private signing keys are excluded from those summaries. Keep raw fixture state private: it can include short-lived synthetic run or approval identifiers.</w:t>
       </w:r>
     </w:p>
     <w:p>
@@ -3975,7 +4171,7 @@
         <w:rPr>
           <w:b w:val="0"/>
         </w:rPr>
-        <w:t>Launchers terminate only their owned child processes and remove their containers/network. Cleanup failure fails the demo. Ignored evidence remains for review. Every scenario uses fixed harmless inputs, fresh variants and bounded counts/deadlines; none attacks a real service. Case 11 has the secure scoped-collaboration demos, but a vulnerable collaboration pair was not included in this comparison plan.</w:t>
+        <w:t>Launchers terminate only their owned child processes and remove their containers/network. Cleanup failure fails the demo. Ignored evidence remains for review until that case is rerun and overwritten. Every scenario uses fixed harmless inputs, fresh variants and bounded counts/deadlines; none attacks a real service. Case 11 has the secure scoped-collaboration demos, but a vulnerable collaboration pair was not included in this comparison plan.</w:t>
       </w:r>
     </w:p>
     <w:p>

</xml_diff>